<commit_message>
Operacje 25 i 30: zamiana frezarki z przystawka na maszyny dedykowane (dlutownica, frezarka obwiedniowa); aktualizacja DOCX/PDF do wersji zad12bV2
Co-authored-by: Maciej <WeaverTech@users.noreply.github.com>
</commit_message>
<xml_diff>
--- a/Karta technologiczna - kolo zebate/karta_technologiczna_uzupelniona.docx
+++ b/Karta technologiczna - kolo zebate/karta_technologiczna_uzupelniona.docx
@@ -791,34 +791,6 @@
               <w:t>Suwmiarka</w:t>
             </w:r>
           </w:p>
-          <w:p>
-            <w:pPr>
-              <w:spacing w:before="0" w:after="0" w:line="240" w:lineRule="auto"/>
-              <w:jc w:val="left"/>
-            </w:pPr>
-            <w:r>
-              <w:rPr>
-                <w:rFonts w:ascii="Arial" w:hAnsi="Arial"/>
-                <w:b w:val="0"/>
-                <w:sz w:val="15"/>
-              </w:rPr>
-              <w:t>Dalmierz laserowy</w:t>
-            </w:r>
-          </w:p>
-          <w:p>
-            <w:pPr>
-              <w:spacing w:before="0" w:after="0" w:line="240" w:lineRule="auto"/>
-              <w:jc w:val="left"/>
-            </w:pPr>
-            <w:r>
-              <w:rPr>
-                <w:rFonts w:ascii="Arial" w:hAnsi="Arial"/>
-                <w:b w:val="0"/>
-                <w:sz w:val="15"/>
-              </w:rPr>
-              <w:t>Taśma tnąca bimetalowa 25×0,9×3950</w:t>
-            </w:r>
-          </w:p>
         </w:tc>
         <w:tc>
           <w:tcPr>
@@ -991,7 +963,7 @@
                 <w:b w:val="0"/>
                 <w:sz w:val="16"/>
               </w:rPr>
-              <w:t>Wyrównanie powierzchni bocznych (czołowych) półfabrykatu w celu uzyskania bazy technologicznej do dalszych operacji.</w:t>
+              <w:t>Frezowanie zgrubne powierzchni czołowych.</w:t>
             </w:r>
           </w:p>
         </w:tc>
@@ -1047,20 +1019,6 @@
                 <w:sz w:val="15"/>
               </w:rPr>
               <w:t>Czujnik zegarowy</w:t>
-            </w:r>
-          </w:p>
-          <w:p>
-            <w:pPr>
-              <w:spacing w:before="0" w:after="0" w:line="240" w:lineRule="auto"/>
-              <w:jc w:val="left"/>
-            </w:pPr>
-            <w:r>
-              <w:rPr>
-                <w:rFonts w:ascii="Arial" w:hAnsi="Arial"/>
-                <w:b w:val="0"/>
-                <w:sz w:val="15"/>
-              </w:rPr>
-              <w:t>Frez nasadzany walcowo-czołowy NFCb + trzpień</w:t>
             </w:r>
           </w:p>
         </w:tc>
@@ -1235,7 +1193,7 @@
                 <w:b w:val="0"/>
                 <w:sz w:val="16"/>
               </w:rPr>
-              <w:t>Wstępne usunięcie naddatku z zewnętrznej średnicy przedmiotu obrabianego, oraz obróbka kształtująca zewnętrznych średnic pod dokładne wymiary przed operacjami nacinania uzębienia i szlifowania.</w:t>
+              <w:t>Toczenie zgrubne i średniodokładne powierzchni walcowej.</w:t>
             </w:r>
           </w:p>
         </w:tc>
@@ -1291,20 +1249,6 @@
                 <w:sz w:val="15"/>
               </w:rPr>
               <w:t>suwmiarka</w:t>
-            </w:r>
-          </w:p>
-          <w:p>
-            <w:pPr>
-              <w:spacing w:before="0" w:after="0" w:line="240" w:lineRule="auto"/>
-              <w:jc w:val="left"/>
-            </w:pPr>
-            <w:r>
-              <w:rPr>
-                <w:rFonts w:ascii="Arial" w:hAnsi="Arial"/>
-                <w:b w:val="0"/>
-                <w:sz w:val="15"/>
-              </w:rPr>
-              <w:t>Nóż tokarski składany do toczenia zewn. (PAFANA, syst. P) + imak TZC-32N1</w:t>
             </w:r>
           </w:p>
         </w:tc>
@@ -1479,7 +1423,7 @@
                 <w:b w:val="0"/>
                 <w:sz w:val="16"/>
               </w:rPr>
-              <w:t>Wykonanie wstępnego otworu osiowego w piaście koła, roztaczanie/frezowanie wewnętrznego otworu w celu zbliżenia geometrii do wymiaru nominalnego, ostateczna obróbka wykańczająca otworu piasty zapewniająca wymaganą tolerancję pasowania.</w:t>
+              <w:t>Wiercenie i powiercanie oraz frezowanie średnio dokładne i wykańczające otworu piasty.</w:t>
             </w:r>
           </w:p>
         </w:tc>
@@ -1535,20 +1479,6 @@
                 <w:sz w:val="15"/>
               </w:rPr>
               <w:t>Uchwyt trójszczękowy</w:t>
-            </w:r>
-          </w:p>
-          <w:p>
-            <w:pPr>
-              <w:spacing w:before="0" w:after="0" w:line="240" w:lineRule="auto"/>
-              <w:jc w:val="left"/>
-            </w:pPr>
-            <w:r>
-              <w:rPr>
-                <w:rFonts w:ascii="Arial" w:hAnsi="Arial"/>
-                <w:b w:val="0"/>
-                <w:sz w:val="15"/>
-              </w:rPr>
-              <w:t>Wiertło kręte NWKc; nóż wytaczak składany (PAFANA, tocz. wewn.); rozwiertak maszynowy NRTc</w:t>
             </w:r>
           </w:p>
         </w:tc>
@@ -1682,35 +1612,7 @@
                 <w:b w:val="0"/>
                 <w:sz w:val="15"/>
               </w:rPr>
-              <w:t>JAFO</w:t>
-            </w:r>
-          </w:p>
-          <w:p>
-            <w:pPr>
-              <w:spacing w:before="0" w:after="0" w:line="240" w:lineRule="auto"/>
-              <w:jc w:val="center"/>
-            </w:pPr>
-            <w:r>
-              <w:rPr>
-                <w:rFonts w:ascii="Arial" w:hAnsi="Arial"/>
-                <w:b w:val="0"/>
-                <w:sz w:val="15"/>
-              </w:rPr>
-              <w:t>Frezarka uniwersalna FWF-32J2</w:t>
-            </w:r>
-          </w:p>
-          <w:p>
-            <w:pPr>
-              <w:spacing w:before="0" w:after="0" w:line="240" w:lineRule="auto"/>
-              <w:jc w:val="center"/>
-            </w:pPr>
-            <w:r>
-              <w:rPr>
-                <w:rFonts w:ascii="Arial" w:hAnsi="Arial"/>
-                <w:b w:val="0"/>
-                <w:sz w:val="15"/>
-              </w:rPr>
-              <w:t>(przyrząd do dłutowania + podzielnica)</w:t>
+              <w:t>Dłutownica</w:t>
             </w:r>
           </w:p>
         </w:tc>
@@ -1737,7 +1639,7 @@
                 <w:b w:val="0"/>
                 <w:sz w:val="16"/>
               </w:rPr>
-              <w:t>Wstępne wybranie materiału pod rowek wpustowy w otworze piasty i wykończenie rowka wpustowego na pełną szerokość i głębokość zgodnie z tolerancją zapisaną w dokumentacji.</w:t>
+              <w:t>Dłutowanie zgrubne i średnio dokładne rowka wpustowego.</w:t>
             </w:r>
           </w:p>
         </w:tc>
@@ -1793,20 +1695,6 @@
                 <w:sz w:val="15"/>
               </w:rPr>
               <w:t>płytki wzorcowe</w:t>
-            </w:r>
-          </w:p>
-          <w:p>
-            <w:pPr>
-              <w:spacing w:before="0" w:after="0" w:line="240" w:lineRule="auto"/>
-              <w:jc w:val="left"/>
-            </w:pPr>
-            <w:r>
-              <w:rPr>
-                <w:rFonts w:ascii="Arial" w:hAnsi="Arial"/>
-                <w:b w:val="0"/>
-                <w:sz w:val="15"/>
-              </w:rPr>
-              <w:t>Nóż dłutowniczy do rowka wpustowego</w:t>
             </w:r>
           </w:p>
         </w:tc>
@@ -1940,35 +1828,7 @@
                 <w:b w:val="0"/>
                 <w:sz w:val="15"/>
               </w:rPr>
-              <w:t>JAFO</w:t>
-            </w:r>
-          </w:p>
-          <w:p>
-            <w:pPr>
-              <w:spacing w:before="0" w:after="0" w:line="240" w:lineRule="auto"/>
-              <w:jc w:val="center"/>
-            </w:pPr>
-            <w:r>
-              <w:rPr>
-                <w:rFonts w:ascii="Arial" w:hAnsi="Arial"/>
-                <w:b w:val="0"/>
-                <w:sz w:val="15"/>
-              </w:rPr>
-              <w:t>Frezarka uniwersalna FWF-32J2</w:t>
-            </w:r>
-          </w:p>
-          <w:p>
-            <w:pPr>
-              <w:spacing w:before="0" w:after="0" w:line="240" w:lineRule="auto"/>
-              <w:jc w:val="center"/>
-            </w:pPr>
-            <w:r>
-              <w:rPr>
-                <w:rFonts w:ascii="Arial" w:hAnsi="Arial"/>
-                <w:b w:val="0"/>
-                <w:sz w:val="15"/>
-              </w:rPr>
-              <w:t>(podzielnica)</w:t>
+              <w:t>Frezarka obwiedniowa do uzębień</w:t>
             </w:r>
           </w:p>
         </w:tc>
@@ -1995,7 +1855,7 @@
                 <w:b w:val="0"/>
                 <w:sz w:val="16"/>
               </w:rPr>
-              <w:t>Nacinanie zębów na wieńcu metodą obwiedniową z pozostawieniem naddatku na operację szlifowania. Ostateczne kształtowanie profilu zęba przed obróbką cieplną w celu minimalizacji naddatków szlifierskich.</w:t>
+              <w:t>Frezowanie obwiedniowe zgrubne i średnio dokładne uzębienia.</w:t>
             </w:r>
           </w:p>
         </w:tc>
@@ -2037,20 +1897,6 @@
                 <w:sz w:val="15"/>
               </w:rPr>
               <w:t>mikrometr talerzykowy</w:t>
-            </w:r>
-          </w:p>
-          <w:p>
-            <w:pPr>
-              <w:spacing w:before="0" w:after="0" w:line="240" w:lineRule="auto"/>
-              <w:jc w:val="left"/>
-            </w:pPr>
-            <w:r>
-              <w:rPr>
-                <w:rFonts w:ascii="Arial" w:hAnsi="Arial"/>
-                <w:b w:val="0"/>
-                <w:sz w:val="15"/>
-              </w:rPr>
-              <w:t>Frez modułowy krążkowy NFMb + trzpień frezarski</w:t>
             </w:r>
           </w:p>
         </w:tc>
@@ -2239,7 +2085,7 @@
                 <w:b w:val="0"/>
                 <w:sz w:val="16"/>
               </w:rPr>
-              <w:t>Wykonanie otworów prostopadłych do osi głównej przedmiotu, wyfrezowanie wybrań/kieszeni redukujących masę własną koła zębatego, usunięcie ostrych krawędzi, gratowanie i sfazowanie krawędzi czołowych otworu oraz krawędzi zębów.</w:t>
+              <w:t>Wiercenie otworów poprzecznych, frezowanie zgrubne powierzchni odciążających oraz wykonanie faz frezem fazującym.</w:t>
             </w:r>
           </w:p>
         </w:tc>
@@ -2295,20 +2141,6 @@
                 <w:sz w:val="15"/>
               </w:rPr>
               <w:t>suwmiarka</w:t>
-            </w:r>
-          </w:p>
-          <w:p>
-            <w:pPr>
-              <w:spacing w:before="0" w:after="0" w:line="240" w:lineRule="auto"/>
-              <w:jc w:val="left"/>
-            </w:pPr>
-            <w:r>
-              <w:rPr>
-                <w:rFonts w:ascii="Arial" w:hAnsi="Arial"/>
-                <w:b w:val="0"/>
-                <w:sz w:val="15"/>
-              </w:rPr>
-              <w:t>Wiertło kręte NWKa; frez trzpieniowy NFPb; pogłębiacz stożkowy NWSa</w:t>
             </w:r>
           </w:p>
         </w:tc>
@@ -2469,7 +2301,7 @@
                 <w:b w:val="0"/>
                 <w:sz w:val="16"/>
               </w:rPr>
-              <w:t>Lokalne hartowanie płomieniowe innych wybranych stref elementu (np. powierzchni czołowych piasty).</w:t>
+              <w:t>Hartowanie ogniowe.</w:t>
             </w:r>
           </w:p>
         </w:tc>
@@ -2845,7 +2677,7 @@
                 <w:b w:val="0"/>
                 <w:sz w:val="16"/>
               </w:rPr>
-              <w:t>Ostateczna obróbka wykańczająca profili zębów po hartowaniu w celu uzyskania wysokiej klasy dokładności geometrii i niskiej chropowatości powierzchni.</w:t>
+              <w:t>Ostateczna obróbka wykańczająca profili zębów po hartowaniu poprzez szlifowanie.</w:t>
             </w:r>
           </w:p>
         </w:tc>
@@ -3047,7 +2879,7 @@
                 <w:b w:val="0"/>
                 <w:sz w:val="16"/>
               </w:rPr>
-              <w:t>Usunięcie pozostałości płynów obróbkowych, olejów hartowniczych oraz zanieczyszczeń po szlifowaniu. Przekazanie gotowego wyrobu do magazynu.</w:t>
+              <w:t>Dokładne mycie i czyszczenie.</w:t>
             </w:r>
           </w:p>
         </w:tc>
@@ -3277,7 +3109,7 @@
                 <w:b w:val="0"/>
                 <w:sz w:val="16"/>
               </w:rPr>
-              <w:t>Ostateczna kontrola metrologiczna gotowego wyrobu. Sprawdzenie zgodności wymiarów liniowych, kątowych, tolerancji kształtu i położenia oraz parametrów struktury geometrycznej powierzchni (chropowatości) z dokumentacją konstrukcyjną.</w:t>
+              <w:t>Ostateczna kontrola wymiarów gotowego wyrobu.</w:t>
             </w:r>
           </w:p>
         </w:tc>
@@ -3444,7 +3276,7 @@
                 <w:b w:val="0"/>
                 <w:sz w:val="18"/>
               </w:rPr>
-              <w:t>Opracował:</w:t>
+              <w:t>Opracował: Jakub Wydra</w:t>
             </w:r>
           </w:p>
         </w:tc>
@@ -3471,7 +3303,7 @@
                 <w:b w:val="0"/>
                 <w:sz w:val="18"/>
               </w:rPr>
-              <w:t>Sprawdził:</w:t>
+              <w:t>Sprawdził: Kacper Tokarski</w:t>
             </w:r>
           </w:p>
         </w:tc>
@@ -3498,7 +3330,7 @@
                 <w:b w:val="0"/>
                 <w:sz w:val="18"/>
               </w:rPr>
-              <w:t>Zatwierdził:</w:t>
+              <w:t>Zatwierdził: Maciej Tkacz</w:t>
             </w:r>
           </w:p>
         </w:tc>

</xml_diff>